<commit_message>
Update agent metadata and graphic art proposal exports
Replit-Commit-Author: Agent
</commit_message>
<xml_diff>
--- a/exports/Zacode-Graphic-Art-Proposal-AR.docx
+++ b/exports/Zacode-Graphic-Art-Proposal-AR.docx
@@ -2685,14 +2685,13 @@
           <w:color w:val="078466"/>
           <w:sz w:val="18"/>
           <w:rtl w:val="1"/>
-          <w:lang w:val="ar-SA"/>
         </w:rPr>
-        <w:t>07 · الخطوة التالية</w:t>
+        <w:t>عمليات البيع والتحصيل</w:t>
       </w:r>
     </w:p>
     <w:p>
       <w:pPr>
-        <w:spacing w:before="0" w:after="80" w:line="288" w:lineRule="auto"/>
+        <w:spacing w:before="0" w:after="100" w:line="288" w:lineRule="auto"/>
         <w:jc w:val="right"/>
         <w:bidi w:val="1"/>
       </w:pPr>
@@ -2703,9 +2702,8 @@
           <w:color w:val="132630"/>
           <w:sz w:val="38"/>
           <w:rtl w:val="1"/>
-          <w:lang w:val="ar-SA"/>
         </w:rPr>
-        <w:t>نحو نطاق واضح وعرض مالي مناسب</w:t>
+        <w:t>بيع واضح، وسداد نقدي أو بنكي</w:t>
       </w:r>
     </w:p>
     <w:p>
@@ -2721,9 +2719,66 @@
           <w:color w:val="435761"/>
           <w:sz w:val="19"/>
           <w:rtl w:val="1"/>
-          <w:lang w:val="ar-SA"/>
         </w:rPr>
-        <w:t>هذا المقترح يوضح طريقة توظيف زاكود في الإدارة التشغيلية والمالية لجرافيك آرت. بعد جلسة تحليل الاحتياج، يُقدم عرض نهائي يحدد ما سيتم تفعيله وتسليمه دون بنود مبهمة.</w:t>
+        <w:t>تصور لدورة تبدأ بفاتورة بيع لخدمات أو مستلزمات الدعاية والإعلان، ثم تسجيل ما تم تحصيله نقدًا في الخزينة أو عبر البنك وربط السداد بفاتورة العميل.</w:t>
+      </w:r>
+    </w:p>
+    <w:p>
+      <w:pPr>
+        <w:spacing w:after="80"/>
+        <w:jc w:val="center"/>
+        <w:bidi w:val="1"/>
+      </w:pPr>
+      <w:r>
+        <w:drawing>
+          <wp:inline xmlns:a="http://schemas.openxmlformats.org/drawingml/2006/main" xmlns:pic="http://schemas.openxmlformats.org/drawingml/2006/picture">
+            <wp:extent cx="6173999" cy="3858749"/>
+            <wp:docPr id="4" name="Picture 4"/>
+            <wp:cNvGraphicFramePr>
+              <a:graphicFrameLocks noChangeAspect="1"/>
+            </wp:cNvGraphicFramePr>
+            <a:graphic>
+              <a:graphicData uri="http://schemas.openxmlformats.org/drawingml/2006/picture">
+                <pic:pic>
+                  <pic:nvPicPr>
+                    <pic:cNvPr id="0" name="graphic-art-sales-payment.png"/>
+                    <pic:cNvPicPr/>
+                  </pic:nvPicPr>
+                  <pic:blipFill>
+                    <a:blip r:embed="rId14"/>
+                    <a:stretch>
+                      <a:fillRect/>
+                    </a:stretch>
+                  </pic:blipFill>
+                  <pic:spPr>
+                    <a:xfrm>
+                      <a:off x="0" y="0"/>
+                      <a:ext cx="6173999" cy="3858749"/>
+                    </a:xfrm>
+                    <a:prstGeom prst="rect"/>
+                  </pic:spPr>
+                </pic:pic>
+              </a:graphicData>
+            </a:graphic>
+          </wp:inline>
+        </w:drawing>
+      </w:r>
+    </w:p>
+    <w:p>
+      <w:pPr>
+        <w:spacing w:before="0" w:after="100" w:line="288" w:lineRule="auto"/>
+        <w:jc w:val="right"/>
+        <w:bidi w:val="1"/>
+      </w:pPr>
+      <w:r>
+        <w:rPr>
+          <w:rFonts w:ascii="Arial" w:hAnsi="Arial" w:cs="Arial" w:eastAsia="Arial"/>
+          <w:b w:val="0"/>
+          <w:color w:val="435761"/>
+          <w:sz w:val="18"/>
+          <w:rtl w:val="1"/>
+        </w:rPr>
+        <w:t>دورة التحصيل: إنشاء فاتورة البيع، تحديد مبلغ السداد وطريقته، ثم إصدار سند قبض نقدي أو بنكي مرتبط بالمستند.</w:t>
       </w:r>
     </w:p>
     <w:tbl>
@@ -2733,12 +2788,12 @@
         <w:tblLook w:firstColumn="1" w:firstRow="1" w:lastColumn="0" w:lastRow="0" w:noHBand="0" w:noVBand="1" w:val="04A0"/>
         <w:bidiVisual w:val="1"/>
         <w:tblBorders>
-          <w:top w:val="single" w:sz="4" w:color="DCE6E8"/>
-          <w:left w:val="single" w:sz="4" w:color="DCE6E8"/>
-          <w:bottom w:val="single" w:sz="4" w:color="DCE6E8"/>
-          <w:right w:val="single" w:sz="4" w:color="DCE6E8"/>
-          <w:insideH w:val="single" w:sz="4" w:color="DCE6E8"/>
-          <w:insideV w:val="single" w:sz="4" w:color="DCE6E8"/>
+          <w:top w:val="single" w:sz="5" w:color="BCE6D7"/>
+          <w:left w:val="single" w:sz="5" w:color="BCE6D7"/>
+          <w:bottom w:val="single" w:sz="5" w:color="BCE6D7"/>
+          <w:right w:val="single" w:sz="5" w:color="BCE6D7"/>
+          <w:insideH w:val="single" w:sz="5" w:color="BCE6D7"/>
+          <w:insideV w:val="single" w:sz="5" w:color="BCE6D7"/>
         </w:tblBorders>
       </w:tblPr>
       <w:tblGrid>
@@ -2748,17 +2803,18 @@
         <w:tc>
           <w:tcPr>
             <w:tcW w:type="dxa" w:w="10036"/>
-            <w:shd w:fill="112D34"/>
+            <w:vAlign w:val="center"/>
+            <w:shd w:fill="EFF9F5"/>
             <w:tcMar>
-              <w:top w:w="150" w:type="dxa"/>
-              <w:start w:w="190" w:type="dxa"/>
-              <w:bottom w:w="150" w:type="dxa"/>
-              <w:end w:w="190" w:type="dxa"/>
+              <w:top w:w="130" w:type="dxa"/>
+              <w:start w:w="180" w:type="dxa"/>
+              <w:bottom w:w="130" w:type="dxa"/>
+              <w:end w:w="180" w:type="dxa"/>
             </w:tcMar>
           </w:tcPr>
           <w:p>
             <w:pPr>
-              <w:spacing w:after="80"/>
+              <w:spacing w:after="0" w:line="288" w:lineRule="auto"/>
               <w:jc w:val="right"/>
               <w:bidi w:val="1"/>
             </w:pPr>
@@ -2766,84 +2822,21 @@
               <w:rPr>
                 <w:rFonts w:ascii="Arial" w:hAnsi="Arial" w:cs="Arial" w:eastAsia="Arial"/>
                 <w:b/>
-                <w:color w:val="D7A72B"/>
-                <w:sz w:val="21"/>
+                <w:color w:val="075B49"/>
+                <w:sz w:val="19"/>
                 <w:rtl w:val="1"/>
-                <w:lang w:val="ar-SA"/>
               </w:rPr>
-              <w:t>العرض المالي التفصيلي سيحدد</w:t>
+              <w:t xml:space="preserve">النقدي والبنكي: </w:t>
             </w:r>
-          </w:p>
-          <w:p>
-            <w:pPr>
-              <w:spacing w:after="40" w:line="264" w:lineRule="auto"/>
-              <w:jc w:val="right"/>
-              <w:bidi w:val="1"/>
-            </w:pPr>
             <w:r>
               <w:rPr>
                 <w:rFonts w:ascii="Arial" w:hAnsi="Arial" w:cs="Arial" w:eastAsia="Arial"/>
                 <w:b w:val="0"/>
-                <w:color w:val="E3EFEB"/>
+                <w:color w:val="435761"/>
                 <w:sz w:val="18"/>
                 <w:rtl w:val="1"/>
-                <w:lang w:val="ar-SA"/>
               </w:rPr>
-              <w:t>•  الوحدات المطلوبة وعدد المستخدمين والشركات والفروع.</w:t>
-            </w:r>
-          </w:p>
-          <w:p>
-            <w:pPr>
-              <w:spacing w:after="40" w:line="264" w:lineRule="auto"/>
-              <w:jc w:val="right"/>
-              <w:bidi w:val="1"/>
-            </w:pPr>
-            <w:r>
-              <w:rPr>
-                <w:rFonts w:ascii="Arial" w:hAnsi="Arial" w:cs="Arial" w:eastAsia="Arial"/>
-                <w:b w:val="0"/>
-                <w:color w:val="E3EFEB"/>
-                <w:sz w:val="18"/>
-                <w:rtl w:val="1"/>
-                <w:lang w:val="ar-SA"/>
-              </w:rPr>
-              <w:t>•  التهيئة والتدريب ونطاق استيراد البيانات.</w:t>
-            </w:r>
-          </w:p>
-          <w:p>
-            <w:pPr>
-              <w:spacing w:after="40" w:line="264" w:lineRule="auto"/>
-              <w:jc w:val="right"/>
-              <w:bidi w:val="1"/>
-            </w:pPr>
-            <w:r>
-              <w:rPr>
-                <w:rFonts w:ascii="Arial" w:hAnsi="Arial" w:cs="Arial" w:eastAsia="Arial"/>
-                <w:b w:val="0"/>
-                <w:color w:val="E3EFEB"/>
-                <w:sz w:val="18"/>
-                <w:rtl w:val="1"/>
-                <w:lang w:val="ar-SA"/>
-              </w:rPr>
-              <w:t>•  متطلبات الاستضافة والتكاملات والفوترة الإلكترونية المحلية.</w:t>
-            </w:r>
-          </w:p>
-          <w:p>
-            <w:pPr>
-              <w:spacing w:after="40" w:line="264" w:lineRule="auto"/>
-              <w:jc w:val="right"/>
-              <w:bidi w:val="1"/>
-            </w:pPr>
-            <w:r>
-              <w:rPr>
-                <w:rFonts w:ascii="Arial" w:hAnsi="Arial" w:cs="Arial" w:eastAsia="Arial"/>
-                <w:b w:val="0"/>
-                <w:color w:val="E3EFEB"/>
-                <w:sz w:val="18"/>
-                <w:rtl w:val="1"/>
-                <w:lang w:val="ar-SA"/>
-              </w:rPr>
-              <w:t>•  مدة التنفيذ والدعم وشروط الدفع والتسليم.</w:t>
+              <w:t>تُحدد الخزينة والحساب البنكي وبيانات التحويل من واقع حسابات الشركة عند التهيئة. لا تتضمن الشاشة أسعارًا أو أرصدة أو بيانات عملاء فعلية.</w:t>
             </w:r>
           </w:p>
         </w:tc>
@@ -2856,249 +2849,23 @@
         <w:bidi w:val="1"/>
       </w:pPr>
     </w:p>
-    <w:tbl>
-      <w:tblPr>
-        <w:tblW w:type="auto" w:w="0"/>
-        <w:jc w:val="center"/>
-        <w:tblLook w:firstColumn="1" w:firstRow="1" w:lastColumn="0" w:lastRow="0" w:noHBand="0" w:noVBand="1" w:val="04A0"/>
-        <w:bidiVisual w:val="1"/>
-        <w:tblBorders>
-          <w:top w:val="single" w:sz="4" w:color="DCE6E8"/>
-          <w:left w:val="single" w:sz="4" w:color="DCE6E8"/>
-          <w:bottom w:val="single" w:sz="4" w:color="DCE6E8"/>
-          <w:right w:val="single" w:sz="4" w:color="DCE6E8"/>
-          <w:insideH w:val="single" w:sz="4" w:color="DCE6E8"/>
-          <w:insideV w:val="single" w:sz="4" w:color="DCE6E8"/>
-        </w:tblBorders>
-      </w:tblPr>
-      <w:tblGrid>
-        <w:gridCol w:w="10036"/>
-      </w:tblGrid>
-      <w:tr>
-        <w:tc>
-          <w:tcPr>
-            <w:tcW w:type="dxa" w:w="10036"/>
-            <w:shd w:fill="EFF9F5"/>
-            <w:tcMar>
-              <w:top w:w="120" w:type="dxa"/>
-              <w:start w:w="165" w:type="dxa"/>
-              <w:bottom w:w="120" w:type="dxa"/>
-              <w:end w:w="165" w:type="dxa"/>
-            </w:tcMar>
-          </w:tcPr>
-          <w:p>
-            <w:pPr>
-              <w:spacing w:after="0" w:line="276" w:lineRule="auto"/>
-              <w:jc w:val="right"/>
-              <w:bidi w:val="1"/>
-            </w:pPr>
-            <w:r>
-              <w:rPr>
-                <w:rFonts w:ascii="Arial" w:hAnsi="Arial" w:cs="Arial" w:eastAsia="Arial"/>
-                <w:b/>
-                <w:color w:val="075B49"/>
-                <w:sz w:val="19"/>
-                <w:rtl w:val="1"/>
-                <w:lang w:val="ar-SA"/>
-              </w:rPr>
-              <w:t xml:space="preserve">تنبيه تجاري: </w:t>
-            </w:r>
-            <w:r>
-              <w:rPr>
-                <w:rFonts w:ascii="Arial" w:hAnsi="Arial" w:cs="Arial" w:eastAsia="Arial"/>
-                <w:b w:val="0"/>
-                <w:color w:val="435761"/>
-                <w:sz w:val="18"/>
-                <w:rtl w:val="1"/>
-                <w:lang w:val="ar-SA"/>
-              </w:rPr>
-              <w:t>هذا مستند مبدئي وليس تسعيرًا نهائيًا أو التزامًا بمدة التنفيذ. الأسعار والمدة ونطاق التسليم ومستوى الدعم تثبت في عرض مالي مستقل بعد الاتفاق على المتطلبات.</w:t>
-            </w:r>
-          </w:p>
-        </w:tc>
-      </w:tr>
-    </w:tbl>
     <w:p>
       <w:pPr>
-        <w:spacing w:before="0" w:after="20" w:line="288" w:lineRule="auto"/>
+        <w:spacing w:before="0" w:after="0" w:line="288" w:lineRule="auto"/>
         <w:jc w:val="right"/>
         <w:bidi w:val="1"/>
       </w:pPr>
+      <w:r>
+        <w:rPr>
+          <w:rFonts w:ascii="Arial" w:hAnsi="Arial" w:cs="Arial" w:eastAsia="Arial"/>
+          <w:b w:val="0"/>
+          <w:color w:val="778992"/>
+          <w:sz w:val="16"/>
+          <w:rtl w:val="1"/>
+        </w:rPr>
+        <w:t>الصورة تصور واجهة مقترحة؛ تفاصيل تسجيل السداد والتقارير والصلاحيات تعتمد على الوحدات والإعدادات المعتمدة.</w:t>
+      </w:r>
     </w:p>
-    <w:tbl>
-      <w:tblPr>
-        <w:tblW w:type="auto" w:w="0"/>
-        <w:jc w:val="center"/>
-        <w:tblLook w:firstColumn="1" w:firstRow="1" w:lastColumn="0" w:lastRow="0" w:noHBand="0" w:noVBand="1" w:val="04A0"/>
-        <w:bidiVisual w:val="1"/>
-        <w:tblBorders>
-          <w:top w:val="single" w:sz="4" w:color="DCE6E8"/>
-          <w:left w:val="single" w:sz="4" w:color="DCE6E8"/>
-          <w:bottom w:val="single" w:sz="4" w:color="DCE6E8"/>
-          <w:right w:val="single" w:sz="4" w:color="DCE6E8"/>
-          <w:insideH w:val="single" w:sz="4" w:color="DCE6E8"/>
-          <w:insideV w:val="single" w:sz="4" w:color="DCE6E8"/>
-        </w:tblBorders>
-      </w:tblPr>
-      <w:tblGrid>
-        <w:gridCol w:w="10036"/>
-      </w:tblGrid>
-      <w:tr>
-        <w:tc>
-          <w:tcPr>
-            <w:tcW w:type="dxa" w:w="10036"/>
-            <w:shd w:fill="EFF9F5"/>
-            <w:tcMar>
-              <w:top w:w="120" w:type="dxa"/>
-              <w:start w:w="165" w:type="dxa"/>
-              <w:bottom w:w="120" w:type="dxa"/>
-              <w:end w:w="165" w:type="dxa"/>
-            </w:tcMar>
-          </w:tcPr>
-          <w:p>
-            <w:pPr>
-              <w:spacing w:after="0" w:line="276" w:lineRule="auto"/>
-              <w:jc w:val="right"/>
-              <w:bidi w:val="1"/>
-            </w:pPr>
-            <w:r>
-              <w:rPr>
-                <w:rFonts w:ascii="Arial" w:hAnsi="Arial" w:cs="Arial" w:eastAsia="Arial"/>
-                <w:b/>
-                <w:color w:val="075B49"/>
-                <w:sz w:val="19"/>
-                <w:rtl w:val="1"/>
-                <w:lang w:val="ar-SA"/>
-              </w:rPr>
-              <w:t xml:space="preserve">الخطوة التالية: </w:t>
-            </w:r>
-            <w:r>
-              <w:rPr>
-                <w:rFonts w:ascii="Arial" w:hAnsi="Arial" w:cs="Arial" w:eastAsia="Arial"/>
-                <w:b w:val="0"/>
-                <w:color w:val="435761"/>
-                <w:sz w:val="18"/>
-                <w:rtl w:val="1"/>
-                <w:lang w:val="ar-SA"/>
-              </w:rPr>
-              <w:t>جلسة تعريفية لتحديد الأولويات، ثم خطة تطبيق وعرض مالي يتوافقان مع احتياجات جرافيك آرت وطبيعة أعمال الدعاية والإعلان.</w:t>
-            </w:r>
-          </w:p>
-        </w:tc>
-      </w:tr>
-    </w:tbl>
-    <w:p>
-      <w:pPr>
-        <w:spacing w:before="0" w:after="20" w:line="288" w:lineRule="auto"/>
-        <w:jc w:val="right"/>
-        <w:bidi w:val="1"/>
-      </w:pPr>
-    </w:p>
-    <w:tbl>
-      <w:tblPr>
-        <w:tblW w:type="auto" w:w="0"/>
-        <w:jc w:val="center"/>
-        <w:tblLook w:firstColumn="1" w:firstRow="1" w:lastColumn="0" w:lastRow="0" w:noHBand="0" w:noVBand="1" w:val="04A0"/>
-        <w:bidiVisual w:val="1"/>
-        <w:tblBorders>
-          <w:top w:val="single" w:sz="4" w:color="DCE6E8"/>
-          <w:left w:val="single" w:sz="4" w:color="DCE6E8"/>
-          <w:bottom w:val="single" w:sz="4" w:color="DCE6E8"/>
-          <w:right w:val="single" w:sz="4" w:color="DCE6E8"/>
-          <w:insideH w:val="single" w:sz="4" w:color="DCE6E8"/>
-          <w:insideV w:val="single" w:sz="4" w:color="DCE6E8"/>
-        </w:tblBorders>
-      </w:tblPr>
-      <w:tblGrid>
-        <w:gridCol w:w="10036"/>
-      </w:tblGrid>
-      <w:tr>
-        <w:tc>
-          <w:tcPr>
-            <w:tcW w:type="dxa" w:w="10036"/>
-            <w:shd w:fill="F3F8F7"/>
-            <w:tcMar>
-              <w:top w:w="140" w:type="dxa"/>
-              <w:start w:w="180" w:type="dxa"/>
-              <w:bottom w:w="140" w:type="dxa"/>
-              <w:end w:w="180" w:type="dxa"/>
-            </w:tcMar>
-          </w:tcPr>
-          <w:p>
-            <w:pPr>
-              <w:spacing w:after="40"/>
-              <w:jc w:val="right"/>
-              <w:bidi w:val="1"/>
-            </w:pPr>
-            <w:r>
-              <w:rPr>
-                <w:rFonts w:ascii="Arial" w:hAnsi="Arial" w:cs="Arial" w:eastAsia="Arial"/>
-                <w:b/>
-                <w:color w:val="075B49"/>
-                <w:sz w:val="21"/>
-                <w:rtl w:val="1"/>
-                <w:lang w:val="ar-SA"/>
-              </w:rPr>
-              <w:t>شركة سيستمورا للنظم والمعلومات والذكاء</w:t>
-            </w:r>
-          </w:p>
-          <w:p>
-            <w:pPr>
-              <w:spacing w:after="20"/>
-              <w:jc w:val="right"/>
-              <w:bidi w:val="1"/>
-            </w:pPr>
-            <w:r>
-              <w:rPr>
-                <w:rFonts w:ascii="Arial" w:hAnsi="Arial" w:cs="Arial" w:eastAsia="Arial"/>
-                <w:b w:val="0"/>
-                <w:color w:val="435761"/>
-                <w:sz w:val="19"/>
-                <w:rtl w:val="1"/>
-                <w:lang w:val="ar-SA"/>
-              </w:rPr>
-              <w:t>المدير التنفيذي</w:t>
-            </w:r>
-          </w:p>
-          <w:p>
-            <w:pPr>
-              <w:spacing w:after="20"/>
-              <w:jc w:val="right"/>
-              <w:bidi w:val="1"/>
-            </w:pPr>
-            <w:r>
-              <w:rPr>
-                <w:rFonts w:ascii="Arial" w:hAnsi="Arial" w:cs="Arial" w:eastAsia="Arial"/>
-                <w:b/>
-                <w:color w:val="132630"/>
-                <w:sz w:val="19"/>
-                <w:rtl w:val="1"/>
-                <w:lang w:val="ar-SA"/>
-              </w:rPr>
-              <w:t>م. سعيد شحاته</w:t>
-            </w:r>
-          </w:p>
-          <w:p>
-            <w:pPr>
-              <w:spacing w:after="20"/>
-              <w:jc w:val="right"/>
-              <w:bidi w:val="1"/>
-            </w:pPr>
-            <w:r>
-              <w:rPr>
-                <w:rFonts w:ascii="Arial" w:hAnsi="Arial" w:cs="Arial" w:eastAsia="Arial"/>
-                <w:b/>
-                <w:color w:val="132630"/>
-                <w:sz w:val="19"/>
-                <w:rtl w:val="1"/>
-                <w:lang w:val="ar-SA"/>
-              </w:rPr>
-              <w:t>رقم الهاتف: 01000903159</w:t>
-            </w:r>
-          </w:p>
-        </w:tc>
-      </w:tr>
-    </w:tbl>
     <w:sectPr>
       <w:headerReference w:type="default" r:id="rId9"/>
       <w:footerReference w:type="default" r:id="rId10"/>

</xml_diff>

<commit_message>
Update graphic art proposal documents and assets
Replit-Commit-Author: Agent
</commit_message>
<xml_diff>
--- a/exports/Zacode-Graphic-Art-Proposal-AR.docx
+++ b/exports/Zacode-Graphic-Art-Proposal-AR.docx
@@ -405,7 +405,7 @@
           <w:rtl w:val="1"/>
           <w:lang w:val="ar-SA"/>
         </w:rPr>
-        <w:t>عرض عام موجّه للشركة؛ لا يتضمن اسم مسؤول أو أسعارًا غير معتمدة.</w:t>
+        <w:t>إعداد: شركة سيستمورا للنظم والمعلومات والذكاء · المدير التنفيذي: م. سعيد شحاته · الهاتف: 01000903159</w:t>
       </w:r>
     </w:p>
     <w:p>
@@ -1145,7 +1145,7 @@
           <w:rtl w:val="1"/>
           <w:lang w:val="ar-SA"/>
         </w:rPr>
-        <w:t>تصور للوحة تجمع مؤشرات العروض والأعمال والمستحقات ومخزون الخامات؛ وتُحدّد المؤشرات الفعلية بحسب التقارير والبيانات التي تعتمدها جرافيك آرت.</w:t>
+        <w:t>لقطة من لوحة التحكم الفعلية في زاكود، تعرض ملخصات المبيعات والحركة التشغيلية المتاحة في النظام.</w:t>
       </w:r>
     </w:p>
     <w:p>
@@ -1204,7 +1204,7 @@
           <w:rtl w:val="1"/>
           <w:lang w:val="ar-SA"/>
         </w:rPr>
-        <w:t>الفائدة: متابعة العناصر التي تحتاج إجراءً الآن، مثل عرض بانتظار المراجعة أو فاتورة مستحقة أو صنف يقترب من حد الطلب.</w:t>
+        <w:t>تجمع لوحة التحكم مؤشرات النظام في مكان واحد، وتختلف الأرقام حسب بيانات المنشأة وحركة الاستخدام.</w:t>
       </w:r>
     </w:p>
     <w:tbl>
@@ -1252,7 +1252,7 @@
                 <w:rtl w:val="1"/>
                 <w:lang w:val="ar-SA"/>
               </w:rPr>
-              <w:t xml:space="preserve">توضيح مهم: </w:t>
+              <w:t xml:space="preserve">توضيح: </w:t>
             </w:r>
             <w:r>
               <w:rPr>
@@ -1263,7 +1263,7 @@
                 <w:rtl w:val="1"/>
                 <w:lang w:val="ar-SA"/>
               </w:rPr>
-              <w:t>هذه صورة تصميمية ببيانات افتراضية لشرح الفكرة؛ ليست لقطة فعلية من حساب جرافيك آرت ولا تعكس أرصدة أو أعمالًا حقيقية.</w:t>
+              <w:t>لقطة فعلية من واجهة زاكود في بيئة معاينة فارغة؛ المؤشرات الظاهرة لا تمثل بيانات أو أرصدة جرافيك آرت.</w:t>
             </w:r>
           </w:p>
         </w:tc>
@@ -1314,7 +1314,7 @@
           <w:rtl w:val="1"/>
           <w:lang w:val="ar-SA"/>
         </w:rPr>
-        <w:t>عرض واضح من البند إلى مستند البيع</w:t>
+        <w:t>فاتورة البيع من شاشة زاكود</w:t>
       </w:r>
     </w:p>
     <w:p>
@@ -1332,7 +1332,7 @@
           <w:rtl w:val="1"/>
           <w:lang w:val="ar-SA"/>
         </w:rPr>
-        <w:t>يمكن تنظيم الخدمات وبنود التوريد والكميات والأسعار وشروط البيع في مسار المبيعات، ثم متابعة المستندات المرتبطة به بحسب إعدادات الشركة.</w:t>
+        <w:t>تعرض اللقطة واجهة إنشاء فاتورة المبيعات الفعلية، بما فيها بيانات العميل ونوع الفاتورة والصنف والسعر والمخزن والعملة وخيارات السداد.</w:t>
       </w:r>
     </w:p>
     <w:p>
@@ -1391,7 +1391,7 @@
           <w:rtl w:val="1"/>
           <w:lang w:val="ar-SA"/>
         </w:rPr>
-        <w:t>مثال مناسب للنشاط: عرض يضم تصميمًا أو طباعة أو توريدًا وتركيبًا، مع توضيح بيانات العميل والبنود ومراحل المراجعة.</w:t>
+        <w:t>لأعمال الوكالة: تهيئة بنود الخدمات والطباعة والتوريد، ثم متابعة الفاتورة والتحصيل وفق دورة العمل المعتمدة.</w:t>
       </w:r>
     </w:p>
     <w:tbl>
@@ -1439,7 +1439,7 @@
                 <w:rtl w:val="1"/>
                 <w:lang w:val="ar-SA"/>
               </w:rPr>
-              <w:t xml:space="preserve">الأسعار والضريبة: </w:t>
+              <w:t xml:space="preserve">تنبيه: </w:t>
             </w:r>
             <w:r>
               <w:rPr>
@@ -1450,7 +1450,7 @@
                 <w:rtl w:val="1"/>
                 <w:lang w:val="ar-SA"/>
               </w:rPr>
-              <w:t>الحقول في الصورة تجريبية وليست أسعارًا أو معالجة ضريبية معتمدة. تُراجع العملة والضريبة ومتطلبات الفوترة المحلية ضمن النطاق الفني والمالي.</w:t>
+              <w:t>لقطة فعلية من شاشة النظام في بيئة معاينة؛ الحقول والإعدادات الظاهرة ليست بيانات أو اعتمادًا ضريبيًا خاصًا بجرافيك آرت.</w:t>
             </w:r>
           </w:p>
         </w:tc>
@@ -1501,7 +1501,7 @@
           <w:rtl w:val="1"/>
           <w:lang w:val="ar-SA"/>
         </w:rPr>
-        <w:t>الخامات والتكاليف ضمن صورة العمل</w:t>
+        <w:t>إدارة المخازن والأصناف</w:t>
       </w:r>
     </w:p>
     <w:p>
@@ -1519,7 +1519,7 @@
           <w:rtl w:val="1"/>
           <w:lang w:val="ar-SA"/>
         </w:rPr>
-        <w:t>متابعة المواد الاستهلاكية والأصناف وحركات الشراء والصرف، مع إمكان استخدام مراكز التكلفة أو المشروع للتحليل بحسب الوحدات والتفعيل المتفق عليه.</w:t>
+        <w:t>لقطة من شاشة المخزون الفعلية، وتوضح مدخل إدارة الأصناف والمخازن والتحويل والجرد وحركات الصرف والتسوية.</w:t>
       </w:r>
     </w:p>
     <w:p>
@@ -1578,7 +1578,7 @@
           <w:rtl w:val="1"/>
           <w:lang w:val="ar-SA"/>
         </w:rPr>
-        <w:t>أمثلة أصناف: خامات الطباعة واللوحات والإضاءة والمواد المستخدمة في التجهيز والتركيب. تُنشأ الأصناف ووحداتها وحدود إعادة الطلب من واقع بيانات الشركة.</w:t>
+        <w:t>في التطبيق: تُهيّأ خامات الطباعة والتجهيز ووحداتها ومخازنها من قائمة بيانات الشركة المعتمدة.</w:t>
       </w:r>
     </w:p>
     <w:tbl>
@@ -1626,7 +1626,7 @@
                 <w:rtl w:val="1"/>
                 <w:lang w:val="ar-SA"/>
               </w:rPr>
-              <w:t xml:space="preserve">القيم في الصورة افتراضية: </w:t>
+              <w:t xml:space="preserve">توضيح: </w:t>
             </w:r>
             <w:r>
               <w:rPr>
@@ -1637,7 +1637,7 @@
                 <w:rtl w:val="1"/>
                 <w:lang w:val="ar-SA"/>
               </w:rPr>
-              <w:t>لا تمثل أرصدة أو تكلفة فعلية، وربط المصروفات والمخزون بمشروع معيّن يثبت في تصميم النطاق قبل بدء التطبيق.</w:t>
+              <w:t>لقطة فعلية من بيئة معاينة بلا أرصدة تشغيلية؛ لا تعكس مخزون جرافيك آرت أو تكلفته.</w:t>
             </w:r>
           </w:p>
         </w:tc>
@@ -2674,7 +2674,7 @@
     </w:p>
     <w:p>
       <w:pPr>
-        <w:spacing w:before="0" w:after="40" w:line="288" w:lineRule="auto"/>
+        <w:spacing w:after="40" w:line="288" w:lineRule="auto"/>
         <w:jc w:val="right"/>
         <w:bidi w:val="1"/>
       </w:pPr>
@@ -2691,7 +2691,7 @@
     </w:p>
     <w:p>
       <w:pPr>
-        <w:spacing w:before="0" w:after="100" w:line="288" w:lineRule="auto"/>
+        <w:spacing w:after="100" w:line="288" w:lineRule="auto"/>
         <w:jc w:val="right"/>
         <w:bidi w:val="1"/>
       </w:pPr>
@@ -2703,12 +2703,12 @@
           <w:sz w:val="38"/>
           <w:rtl w:val="1"/>
         </w:rPr>
-        <w:t>بيع واضح، وسداد نقدي أو بنكي</w:t>
+        <w:t>تحصيل فاتورة البيع نقدًا أو عبر البنك</w:t>
       </w:r>
     </w:p>
     <w:p>
       <w:pPr>
-        <w:spacing w:before="0" w:after="120" w:line="288" w:lineRule="auto"/>
+        <w:spacing w:after="120" w:line="288" w:lineRule="auto"/>
         <w:jc w:val="right"/>
         <w:bidi w:val="1"/>
       </w:pPr>
@@ -2720,7 +2720,7 @@
           <w:sz w:val="19"/>
           <w:rtl w:val="1"/>
         </w:rPr>
-        <w:t>تصور لدورة تبدأ بفاتورة بيع لخدمات أو مستلزمات الدعاية والإعلان، ثم تسجيل ما تم تحصيله نقدًا في الخزينة أو عبر البنك وربط السداد بفاتورة العميل.</w:t>
+        <w:t>تُسجّل الدفعة من سند القبض الفعلي في النظام، مع اختيار طريقة التحصيل وربط السداد بفاتورة العميل عند الحاجة.</w:t>
       </w:r>
     </w:p>
     <w:p>
@@ -2741,7 +2741,7 @@
               <a:graphicData uri="http://schemas.openxmlformats.org/drawingml/2006/picture">
                 <pic:pic>
                   <pic:nvPicPr>
-                    <pic:cNvPr id="0" name="graphic-art-sales-payment.png"/>
+                    <pic:cNvPr id="0" name="image.png"/>
                     <pic:cNvPicPr/>
                   </pic:nvPicPr>
                   <pic:blipFill>
@@ -2766,7 +2766,7 @@
     </w:p>
     <w:p>
       <w:pPr>
-        <w:spacing w:before="0" w:after="100" w:line="288" w:lineRule="auto"/>
+        <w:spacing w:after="100" w:line="288" w:lineRule="auto"/>
         <w:jc w:val="right"/>
         <w:bidi w:val="1"/>
       </w:pPr>
@@ -2778,7 +2778,7 @@
           <w:sz w:val="18"/>
           <w:rtl w:val="1"/>
         </w:rPr>
-        <w:t>دورة التحصيل: إنشاء فاتورة البيع، تحديد مبلغ السداد وطريقته، ثم إصدار سند قبض نقدي أو بنكي مرتبط بالمستند.</w:t>
+        <w:t>السداد البنكي: اختيار الحساب البنكي وإدخال بيانات التحويل. تتيح الشاشة نفسها التبديل إلى التحصيل النقدي واختيار الخزينة.</w:t>
       </w:r>
     </w:p>
     <w:tbl>
@@ -2806,10 +2806,10 @@
             <w:vAlign w:val="center"/>
             <w:shd w:fill="EFF9F5"/>
             <w:tcMar>
-              <w:top w:w="130" w:type="dxa"/>
-              <w:start w:w="180" w:type="dxa"/>
-              <w:bottom w:w="130" w:type="dxa"/>
-              <w:end w:w="180" w:type="dxa"/>
+              <w:top w:w="120" w:type="dxa"/>
+              <w:start w:w="170" w:type="dxa"/>
+              <w:bottom w:w="120" w:type="dxa"/>
+              <w:end w:w="170" w:type="dxa"/>
             </w:tcMar>
           </w:tcPr>
           <w:p>
@@ -2823,10 +2823,10 @@
                 <w:rFonts w:ascii="Arial" w:hAnsi="Arial" w:cs="Arial" w:eastAsia="Arial"/>
                 <w:b/>
                 <w:color w:val="075B49"/>
-                <w:sz w:val="19"/>
+                <w:sz w:val="18"/>
                 <w:rtl w:val="1"/>
               </w:rPr>
-              <w:t xml:space="preserve">النقدي والبنكي: </w:t>
+              <w:t xml:space="preserve">لقطة فعلية: </w:t>
             </w:r>
             <w:r>
               <w:rPr>
@@ -2836,7 +2836,7 @@
                 <w:sz w:val="18"/>
                 <w:rtl w:val="1"/>
               </w:rPr>
-              <w:t>تُحدد الخزينة والحساب البنكي وبيانات التحويل من واقع حسابات الشركة عند التهيئة. لا تتضمن الشاشة أسعارًا أو أرصدة أو بيانات عملاء فعلية.</w:t>
+              <w:t>صورة من واجهة زاكود في بيئة معاينة فارغة؛ لا تعرض بيانات عملاء أو أرصدة تخص جرافيك آرت.</w:t>
             </w:r>
           </w:p>
         </w:tc>
@@ -2844,14 +2844,90 @@
     </w:tbl>
     <w:p>
       <w:pPr>
-        <w:spacing w:before="0" w:after="20" w:line="288" w:lineRule="auto"/>
+        <w:spacing w:after="20" w:line="288" w:lineRule="auto"/>
         <w:jc w:val="right"/>
         <w:bidi w:val="1"/>
       </w:pPr>
     </w:p>
+    <w:tbl>
+      <w:tblPr>
+        <w:tblW w:type="auto" w:w="0"/>
+        <w:jc w:val="center"/>
+        <w:tblLook w:firstColumn="1" w:firstRow="1" w:lastColumn="0" w:lastRow="0" w:noHBand="0" w:noVBand="1" w:val="04A0"/>
+        <w:bidiVisual w:val="1"/>
+      </w:tblPr>
+      <w:tblGrid>
+        <w:gridCol w:w="10036"/>
+      </w:tblGrid>
+      <w:tr>
+        <w:tc>
+          <w:tcPr>
+            <w:tcW w:type="dxa" w:w="10036"/>
+            <w:shd w:fill="F3F8F7"/>
+            <w:tcMar>
+              <w:top w:w="130" w:type="dxa"/>
+              <w:start w:w="180" w:type="dxa"/>
+              <w:bottom w:w="130" w:type="dxa"/>
+              <w:end w:w="180" w:type="dxa"/>
+            </w:tcMar>
+          </w:tcPr>
+          <w:p>
+            <w:pPr>
+              <w:spacing w:after="40"/>
+              <w:jc w:val="right"/>
+              <w:bidi w:val="1"/>
+            </w:pPr>
+            <w:r>
+              <w:rPr>
+                <w:rFonts w:ascii="Arial" w:hAnsi="Arial" w:cs="Arial" w:eastAsia="Arial"/>
+                <w:b/>
+                <w:color w:val="075B49"/>
+                <w:sz w:val="21"/>
+                <w:rtl w:val="1"/>
+              </w:rPr>
+              <w:t>شركة سيستمورا للنظم والمعلومات والذكاء</w:t>
+            </w:r>
+          </w:p>
+          <w:p>
+            <w:pPr>
+              <w:spacing w:after="20"/>
+              <w:jc w:val="right"/>
+              <w:bidi w:val="1"/>
+            </w:pPr>
+            <w:r>
+              <w:rPr>
+                <w:rFonts w:ascii="Arial" w:hAnsi="Arial" w:cs="Arial" w:eastAsia="Arial"/>
+                <w:b/>
+                <w:color w:val="132630"/>
+                <w:sz w:val="19"/>
+                <w:rtl w:val="1"/>
+              </w:rPr>
+              <w:t>المدير التنفيذي: م. سعيد شحاته</w:t>
+            </w:r>
+          </w:p>
+          <w:p>
+            <w:pPr>
+              <w:spacing w:after="20"/>
+              <w:jc w:val="right"/>
+              <w:bidi w:val="1"/>
+            </w:pPr>
+            <w:r>
+              <w:rPr>
+                <w:rFonts w:ascii="Arial" w:hAnsi="Arial" w:cs="Arial" w:eastAsia="Arial"/>
+                <w:b/>
+                <w:color w:val="132630"/>
+                <w:sz w:val="19"/>
+                <w:rtl w:val="1"/>
+              </w:rPr>
+              <w:t>رقم الهاتف: 01000903159</w:t>
+            </w:r>
+          </w:p>
+        </w:tc>
+      </w:tr>
+    </w:tbl>
     <w:p>
       <w:pPr>
-        <w:spacing w:before="0" w:after="0" w:line="288" w:lineRule="auto"/>
+        <w:spacing w:after="0" w:line="288" w:lineRule="auto"/>
         <w:jc w:val="right"/>
         <w:bidi w:val="1"/>
       </w:pPr>
@@ -2863,7 +2939,7 @@
           <w:sz w:val="16"/>
           <w:rtl w:val="1"/>
         </w:rPr>
-        <w:t>الصورة تصور واجهة مقترحة؛ تفاصيل تسجيل السداد والتقارير والصلاحيات تعتمد على الوحدات والإعدادات المعتمدة.</w:t>
+        <w:t>تُحدد الخزينة والحساب البنكي المعتمدان عند تهيئة بيانات الشركة.</w:t>
       </w:r>
     </w:p>
     <w:sectPr>

</xml_diff>